<commit_message>
Actualizado los archivos del repositorio. Eliminados los ejemplos de php
</commit_message>
<xml_diff>
--- a/consignas/php-ejercicios.docx
+++ b/consignas/php-ejercicios.docx
@@ -25,8 +25,941 @@
     </w:p>
     <w:p>
       <w:pPr>
-        <w:rPr/>
-      </w:pPr>
+        <w:pStyle w:val="Heading2"/>
+        <w:rPr>
+          <w:sz w:val="22"/>
+          <w:szCs w:val="22"/>
+        </w:rPr>
+      </w:pPr>
+      <w:bookmarkStart w:colFirst="0" w:colLast="0" w:name="_prjuv72v5zal" w:id="1"/>
+      <w:bookmarkEnd w:id="1"/>
+      <w:r>
+        <w:rPr>
+          <w:sz w:val="22"/>
+          <w:szCs w:val="22"/>
+          <w:rtl w:val="0"/>
+        </w:rPr>
+        <w:t xml:space="preserve">Página de empresa</w:t>
+      </w:r>
+    </w:p>
+    <w:p>
+      <w:pPr>
+        <w:rPr>
+          <w:highlight w:val="white"/>
+        </w:rPr>
+      </w:pPr>
+      <w:r>
+        <w:rPr>
+          <w:highlight w:val="white"/>
+          <w:rtl w:val="0"/>
+        </w:rPr>
+        <w:br w:type="textWrapping"/>
+        <w:t xml:space="preserve">Realizar una página que publique la información de una empresa.</w:t>
+      </w:r>
+    </w:p>
+    <w:p>
+      <w:pPr>
+        <w:rPr>
+          <w:highlight w:val="white"/>
+        </w:rPr>
+      </w:pPr>
+      <w:r>
+        <w:rPr>
+          <w:highlight w:val="white"/>
+          <w:rtl w:val="0"/>
+        </w:rPr>
+        <w:t xml:space="preserve">Los datos a mostrar son los siguientes: nombre, descripción, dirección, localidad, código postal, país, teléfono y correo electrónico.</w:t>
+      </w:r>
+    </w:p>
+    <w:p>
+      <w:pPr>
+        <w:rPr>
+          <w:highlight w:val="white"/>
+        </w:rPr>
+      </w:pPr>
+      <w:r>
+        <w:rPr>
+          <w:highlight w:val="white"/>
+          <w:rtl w:val="0"/>
+        </w:rPr>
+        <w:t xml:space="preserve">Cargar la información en variables PHP y luego mostrarla con HTML.</w:t>
+      </w:r>
+    </w:p>
+    <w:p>
+      <w:pPr>
+        <w:pStyle w:val="Heading2"/>
+        <w:rPr>
+          <w:sz w:val="22"/>
+          <w:szCs w:val="22"/>
+        </w:rPr>
+      </w:pPr>
+      <w:bookmarkStart w:colFirst="0" w:colLast="0" w:name="_59z66zdnmop" w:id="2"/>
+      <w:bookmarkEnd w:id="2"/>
+      <w:r>
+        <w:rPr>
+          <w:sz w:val="22"/>
+          <w:szCs w:val="22"/>
+          <w:rtl w:val="0"/>
+        </w:rPr>
+        <w:t xml:space="preserve">Notas de parciales</w:t>
+      </w:r>
+    </w:p>
+    <w:p>
+      <w:pPr>
+        <w:rPr/>
+      </w:pPr>
+      <w:r>
+        <w:rPr>
+          <w:rtl w:val="0"/>
+        </w:rPr>
+      </w:r>
+    </w:p>
+    <w:p>
+      <w:pPr>
+        <w:rPr/>
+      </w:pPr>
+      <w:r>
+        <w:rPr>
+          <w:rtl w:val="0"/>
+        </w:rPr>
+        <w:t xml:space="preserve">Hacer una página que muestre las notas por alumno de cada uno de los 3 parciales del año.</w:t>
+      </w:r>
+    </w:p>
+    <w:p>
+      <w:pPr>
+        <w:rPr/>
+      </w:pPr>
+      <w:r>
+        <w:rPr>
+          <w:rtl w:val="0"/>
+        </w:rPr>
+        <w:t xml:space="preserve">Cargar los datos en un arreglo PHP y mostrarlos con HTML en una tabla.</w:t>
+      </w:r>
+    </w:p>
+    <w:p>
+      <w:pPr>
+        <w:pStyle w:val="Heading2"/>
+        <w:rPr>
+          <w:sz w:val="22"/>
+          <w:szCs w:val="22"/>
+        </w:rPr>
+      </w:pPr>
+      <w:bookmarkStart w:colFirst="0" w:colLast="0" w:name="_s5nxnuhyo3dz" w:id="3"/>
+      <w:bookmarkEnd w:id="3"/>
+      <w:r>
+        <w:rPr>
+          <w:sz w:val="22"/>
+          <w:szCs w:val="22"/>
+          <w:rtl w:val="0"/>
+        </w:rPr>
+        <w:t xml:space="preserve">Formulario de datos</w:t>
+      </w:r>
+    </w:p>
+    <w:p>
+      <w:pPr>
+        <w:rPr/>
+      </w:pPr>
+      <w:r>
+        <w:rPr>
+          <w:rtl w:val="0"/>
+        </w:rPr>
+      </w:r>
+    </w:p>
+    <w:p>
+      <w:pPr>
+        <w:rPr/>
+      </w:pPr>
+      <w:r>
+        <w:rPr>
+          <w:rtl w:val="0"/>
+        </w:rPr>
+        <w:t xml:space="preserve">Crear un formulario HTML que envíe información a una página PHP, donde se muestren los datos recibidos.</w:t>
+      </w:r>
+    </w:p>
+    <w:p>
+      <w:pPr>
+        <w:rPr/>
+      </w:pPr>
+      <w:r>
+        <w:rPr>
+          <w:rtl w:val="0"/>
+        </w:rPr>
+        <w:t xml:space="preserve">Debe contener los siguientes campos: </w:t>
+      </w:r>
+    </w:p>
+    <w:p>
+      <w:pPr>
+        <w:numPr>
+          <w:ilvl w:val="0"/>
+          <w:numId w:val="2"/>
+        </w:numPr>
+        <w:ind w:left="720" w:hanging="360"/>
+      </w:pPr>
+      <w:r>
+        <w:rPr>
+          <w:rtl w:val="0"/>
+        </w:rPr>
+        <w:t xml:space="preserve">Nombre (input text) </w:t>
+      </w:r>
+    </w:p>
+    <w:p>
+      <w:pPr>
+        <w:numPr>
+          <w:ilvl w:val="0"/>
+          <w:numId w:val="2"/>
+        </w:numPr>
+        <w:ind w:left="720" w:hanging="360"/>
+      </w:pPr>
+      <w:r>
+        <w:rPr>
+          <w:rtl w:val="0"/>
+        </w:rPr>
+        <w:t xml:space="preserve">Email (input email) </w:t>
+      </w:r>
+    </w:p>
+    <w:p>
+      <w:pPr>
+        <w:numPr>
+          <w:ilvl w:val="0"/>
+          <w:numId w:val="2"/>
+        </w:numPr>
+        <w:ind w:left="720" w:hanging="360"/>
+      </w:pPr>
+      <w:r>
+        <w:rPr>
+          <w:rtl w:val="0"/>
+        </w:rPr>
+        <w:t xml:space="preserve">Nivel educativo (select)</w:t>
+      </w:r>
+    </w:p>
+    <w:p>
+      <w:pPr>
+        <w:numPr>
+          <w:ilvl w:val="0"/>
+          <w:numId w:val="2"/>
+        </w:numPr>
+        <w:ind w:left="720" w:hanging="360"/>
+      </w:pPr>
+      <w:r>
+        <w:rPr>
+          <w:rtl w:val="0"/>
+        </w:rPr>
+        <w:t xml:space="preserve">Ubicación (input radio)</w:t>
+      </w:r>
+    </w:p>
+    <w:p>
+      <w:pPr>
+        <w:numPr>
+          <w:ilvl w:val="0"/>
+          <w:numId w:val="2"/>
+        </w:numPr>
+        <w:ind w:left="720" w:hanging="360"/>
+      </w:pPr>
+      <w:r>
+        <w:rPr>
+          <w:rtl w:val="0"/>
+        </w:rPr>
+        <w:t xml:space="preserve">Servicios (select múltiple)</w:t>
+      </w:r>
+    </w:p>
+    <w:p>
+      <w:pPr>
+        <w:numPr>
+          <w:ilvl w:val="0"/>
+          <w:numId w:val="2"/>
+        </w:numPr>
+        <w:ind w:left="720" w:hanging="360"/>
+      </w:pPr>
+      <w:r>
+        <w:rPr>
+          <w:rtl w:val="0"/>
+        </w:rPr>
+        <w:t xml:space="preserve">Mensaje (textarea) </w:t>
+      </w:r>
+    </w:p>
+    <w:p>
+      <w:pPr>
+        <w:numPr>
+          <w:ilvl w:val="0"/>
+          <w:numId w:val="2"/>
+        </w:numPr>
+        <w:ind w:left="720" w:hanging="360"/>
+      </w:pPr>
+      <w:r>
+        <w:rPr>
+          <w:rtl w:val="0"/>
+        </w:rPr>
+        <w:t xml:space="preserve">¿Acepta las condiciones de los servicios? (input checkbox).</w:t>
+      </w:r>
+    </w:p>
+    <w:p>
+      <w:pPr>
+        <w:rPr/>
+      </w:pPr>
+      <w:r>
+        <w:rPr>
+          <w:rtl w:val="0"/>
+        </w:rPr>
+        <w:t xml:space="preserve">Además, informar la cantidad de datos POST recibidos.</w:t>
+      </w:r>
+    </w:p>
+    <w:p>
+      <w:pPr>
+        <w:pStyle w:val="Heading2"/>
+        <w:rPr>
+          <w:sz w:val="22"/>
+          <w:szCs w:val="22"/>
+        </w:rPr>
+      </w:pPr>
+      <w:bookmarkStart w:colFirst="0" w:colLast="0" w:name="_qnn398v3hsgd" w:id="4"/>
+      <w:bookmarkEnd w:id="4"/>
+      <w:r>
+        <w:rPr>
+          <w:sz w:val="22"/>
+          <w:szCs w:val="22"/>
+          <w:rtl w:val="0"/>
+        </w:rPr>
+        <w:t xml:space="preserve">Notas de parciales (con estructuras de control)</w:t>
+      </w:r>
+    </w:p>
+    <w:p>
+      <w:pPr>
+        <w:rPr/>
+      </w:pPr>
+      <w:r>
+        <w:rPr>
+          <w:rtl w:val="0"/>
+        </w:rPr>
+      </w:r>
+    </w:p>
+    <w:p>
+      <w:pPr>
+        <w:rPr/>
+      </w:pPr>
+      <w:r>
+        <w:rPr>
+          <w:rtl w:val="0"/>
+        </w:rPr>
+        <w:t xml:space="preserve">Ídem ejercicio "Notas de parciales", pero incluyendo los datos desde otro archivo PHP,</w:t>
+      </w:r>
+    </w:p>
+    <w:p>
+      <w:pPr>
+        <w:rPr/>
+      </w:pPr>
+      <w:r>
+        <w:rPr>
+          <w:rtl w:val="0"/>
+        </w:rPr>
+        <w:t xml:space="preserve">y realizando la carga en 3 tablas con while, for, y foreach respectivamente.</w:t>
+      </w:r>
+    </w:p>
+    <w:p>
+      <w:pPr>
+        <w:pStyle w:val="Heading2"/>
+        <w:rPr>
+          <w:sz w:val="22"/>
+          <w:szCs w:val="22"/>
+        </w:rPr>
+      </w:pPr>
+      <w:bookmarkStart w:colFirst="0" w:colLast="0" w:name="_kyyh2z8eirub" w:id="5"/>
+      <w:bookmarkEnd w:id="5"/>
+      <w:r>
+        <w:rPr>
+          <w:sz w:val="22"/>
+          <w:szCs w:val="22"/>
+          <w:rtl w:val="0"/>
+        </w:rPr>
+        <w:t xml:space="preserve">Plantilla reutilizable</w:t>
+      </w:r>
+    </w:p>
+    <w:p>
+      <w:pPr>
+        <w:rPr/>
+      </w:pPr>
+      <w:r>
+        <w:rPr>
+          <w:rtl w:val="0"/>
+        </w:rPr>
+      </w:r>
+    </w:p>
+    <w:p>
+      <w:pPr>
+        <w:rPr/>
+      </w:pPr>
+      <w:r>
+        <w:rPr>
+          <w:rtl w:val="0"/>
+        </w:rPr>
+        <w:t xml:space="preserve">Hacer una página donde el encabezado y pie se carguen incluyendo archivos.</w:t>
+      </w:r>
+    </w:p>
+    <w:p>
+      <w:pPr>
+        <w:rPr/>
+      </w:pPr>
+      <w:r>
+        <w:rPr>
+          <w:rtl w:val="0"/>
+        </w:rPr>
+        <w:t xml:space="preserve">Realizar pruebas utilizando include y require, con/sin _once.</w:t>
+      </w:r>
+    </w:p>
+    <w:p>
+      <w:pPr>
+        <w:pStyle w:val="Heading2"/>
+        <w:rPr>
+          <w:sz w:val="22"/>
+          <w:szCs w:val="22"/>
+        </w:rPr>
+      </w:pPr>
+      <w:bookmarkStart w:colFirst="0" w:colLast="0" w:name="_jltuyavgx029" w:id="6"/>
+      <w:bookmarkEnd w:id="6"/>
+      <w:r>
+        <w:rPr>
+          <w:sz w:val="22"/>
+          <w:szCs w:val="22"/>
+          <w:rtl w:val="0"/>
+        </w:rPr>
+        <w:t xml:space="preserve">Traducción de números</w:t>
+      </w:r>
+    </w:p>
+    <w:p>
+      <w:pPr>
+        <w:rPr/>
+      </w:pPr>
+      <w:r>
+        <w:rPr>
+          <w:rtl w:val="0"/>
+        </w:rPr>
+      </w:r>
+    </w:p>
+    <w:p>
+      <w:pPr>
+        <w:rPr/>
+      </w:pPr>
+      <w:r>
+        <w:rPr>
+          <w:rtl w:val="0"/>
+        </w:rPr>
+        <w:t xml:space="preserve">Hacer una página dinámica que permita mostrar los nombres de los números del 1 al 10 en idioma español o inglés.</w:t>
+      </w:r>
+    </w:p>
+    <w:p>
+      <w:pPr>
+        <w:rPr/>
+      </w:pPr>
+      <w:r>
+        <w:rPr>
+          <w:rtl w:val="0"/>
+        </w:rPr>
+        <w:t xml:space="preserve">Cargar un diccionario desde un archivo externo según el idioma seleccionado.</w:t>
+      </w:r>
+    </w:p>
+    <w:p>
+      <w:pPr>
+        <w:rPr/>
+      </w:pPr>
+      <w:r>
+        <w:rPr>
+          <w:rtl w:val="0"/>
+        </w:rPr>
+      </w:r>
+    </w:p>
+    <w:p>
+      <w:pPr>
+        <w:pStyle w:val="Heading2"/>
+        <w:rPr>
+          <w:sz w:val="22"/>
+          <w:szCs w:val="22"/>
+        </w:rPr>
+      </w:pPr>
+      <w:bookmarkStart w:colFirst="0" w:colLast="0" w:name="_x2ghnz3no04j" w:id="7"/>
+      <w:bookmarkEnd w:id="7"/>
+      <w:r>
+        <w:rPr>
+          <w:sz w:val="22"/>
+          <w:szCs w:val="22"/>
+          <w:rtl w:val="0"/>
+        </w:rPr>
+        <w:t xml:space="preserve">Notas de parciales (con funciones)</w:t>
+      </w:r>
+    </w:p>
+    <w:p>
+      <w:pPr>
+        <w:rPr/>
+      </w:pPr>
+      <w:r>
+        <w:rPr>
+          <w:rtl w:val="0"/>
+        </w:rPr>
+      </w:r>
+    </w:p>
+    <w:p>
+      <w:pPr>
+        <w:rPr/>
+      </w:pPr>
+      <w:r>
+        <w:rPr>
+          <w:rtl w:val="0"/>
+        </w:rPr>
+        <w:t xml:space="preserve">Ídem ejercicio "Notas de parciales", donde además se muestre:</w:t>
+      </w:r>
+    </w:p>
+    <w:p>
+      <w:pPr>
+        <w:numPr>
+          <w:ilvl w:val="0"/>
+          <w:numId w:val="3"/>
+        </w:numPr>
+        <w:ind w:left="720" w:hanging="360"/>
+      </w:pPr>
+      <w:r>
+        <w:rPr>
+          <w:rtl w:val="0"/>
+        </w:rPr>
+        <w:t xml:space="preserve">El promedio por alumno.</w:t>
+      </w:r>
+    </w:p>
+    <w:p>
+      <w:pPr>
+        <w:numPr>
+          <w:ilvl w:val="0"/>
+          <w:numId w:val="3"/>
+        </w:numPr>
+        <w:ind w:left="720" w:hanging="360"/>
+      </w:pPr>
+      <w:r>
+        <w:rPr>
+          <w:rtl w:val="0"/>
+        </w:rPr>
+        <w:t xml:space="preserve">La nota más alta y la más baja.</w:t>
+      </w:r>
+    </w:p>
+    <w:p>
+      <w:pPr>
+        <w:numPr>
+          <w:ilvl w:val="0"/>
+          <w:numId w:val="3"/>
+        </w:numPr>
+        <w:ind w:left="720" w:hanging="360"/>
+      </w:pPr>
+      <w:r>
+        <w:rPr>
+          <w:rtl w:val="0"/>
+        </w:rPr>
+        <w:t xml:space="preserve">El promedio más alto y el más bajo.</w:t>
+      </w:r>
+    </w:p>
+    <w:p>
+      <w:pPr>
+        <w:rPr/>
+      </w:pPr>
+      <w:r>
+        <w:rPr>
+          <w:rtl w:val="0"/>
+        </w:rPr>
+        <w:t xml:space="preserve">Implementar funciones definidas por el usuario e internas de PHP.</w:t>
+      </w:r>
+    </w:p>
+    <w:p>
+      <w:pPr>
+        <w:pStyle w:val="Heading2"/>
+        <w:rPr>
+          <w:sz w:val="22"/>
+          <w:szCs w:val="22"/>
+        </w:rPr>
+      </w:pPr>
+      <w:bookmarkStart w:colFirst="0" w:colLast="0" w:name="_xb2q3z43qbof" w:id="8"/>
+      <w:bookmarkEnd w:id="8"/>
+      <w:r>
+        <w:rPr>
+          <w:sz w:val="22"/>
+          <w:szCs w:val="22"/>
+          <w:rtl w:val="0"/>
+        </w:rPr>
+        <w:t xml:space="preserve">Sorteo de nombres</w:t>
+      </w:r>
+    </w:p>
+    <w:p>
+      <w:pPr>
+        <w:rPr/>
+      </w:pPr>
+      <w:r>
+        <w:rPr>
+          <w:rtl w:val="0"/>
+        </w:rPr>
+      </w:r>
+    </w:p>
+    <w:p>
+      <w:pPr>
+        <w:rPr/>
+      </w:pPr>
+      <w:r>
+        <w:rPr>
+          <w:rtl w:val="0"/>
+        </w:rPr>
+        <w:t xml:space="preserve">Hacer una página que permita ingresar un conjunto de nombres separados por coma (,) y luego realizar un sorteo, donde se listen los nombres ordenados de forma aleatoria.</w:t>
+      </w:r>
+    </w:p>
+    <w:p>
+      <w:pPr>
+        <w:rPr/>
+      </w:pPr>
+      <w:r>
+        <w:rPr>
+          <w:rtl w:val="0"/>
+        </w:rPr>
+        <w:t xml:space="preserve">Validar los datos ingresados, e informar errores.</w:t>
+      </w:r>
+    </w:p>
+    <w:p>
+      <w:pPr>
+        <w:rPr/>
+      </w:pPr>
+      <w:r>
+        <w:rPr>
+          <w:rtl w:val="0"/>
+        </w:rPr>
+        <w:t xml:space="preserve">Implementar funciones definidas por el usuario e internas de PHP.</w:t>
+      </w:r>
+    </w:p>
+    <w:p>
+      <w:pPr>
+        <w:pStyle w:val="Heading2"/>
+        <w:rPr>
+          <w:sz w:val="22"/>
+          <w:szCs w:val="22"/>
+        </w:rPr>
+      </w:pPr>
+      <w:bookmarkStart w:colFirst="0" w:colLast="0" w:name="_f0jt179vflzw" w:id="9"/>
+      <w:bookmarkEnd w:id="9"/>
+      <w:r>
+        <w:rPr>
+          <w:sz w:val="22"/>
+          <w:szCs w:val="22"/>
+          <w:rtl w:val="0"/>
+        </w:rPr>
+        <w:t xml:space="preserve">Calculadora</w:t>
+      </w:r>
+    </w:p>
+    <w:p>
+      <w:pPr>
+        <w:rPr/>
+      </w:pPr>
+      <w:r>
+        <w:rPr>
+          <w:rtl w:val="0"/>
+        </w:rPr>
+      </w:r>
+    </w:p>
+    <w:p>
+      <w:pPr>
+        <w:rPr/>
+      </w:pPr>
+      <w:r>
+        <w:rPr>
+          <w:rtl w:val="0"/>
+        </w:rPr>
+        <w:t xml:space="preserve">Hacer un formulario que permita ingresar dos valores y realizar la suma, resta,</w:t>
+      </w:r>
+    </w:p>
+    <w:p>
+      <w:pPr>
+        <w:rPr/>
+      </w:pPr>
+      <w:r>
+        <w:rPr>
+          <w:rtl w:val="0"/>
+        </w:rPr>
+        <w:t xml:space="preserve">multiplicación o división de los mismos.  </w:t>
+      </w:r>
+    </w:p>
+    <w:p>
+      <w:pPr>
+        <w:rPr/>
+      </w:pPr>
+      <w:r>
+        <w:rPr>
+          <w:rtl w:val="0"/>
+        </w:rPr>
+        <w:t xml:space="preserve">Mostrar en otra página la operación realizada y el resultado obtenido.</w:t>
+      </w:r>
+    </w:p>
+    <w:p>
+      <w:pPr>
+        <w:rPr/>
+      </w:pPr>
+      <w:r>
+        <w:rPr>
+          <w:rtl w:val="0"/>
+        </w:rPr>
+        <w:t xml:space="preserve">Implementar una clase que gestione los datos y cálculos, incluida desde otro archivo PHP.</w:t>
+      </w:r>
+    </w:p>
+    <w:p>
+      <w:pPr>
+        <w:rPr/>
+      </w:pPr>
+      <w:r>
+        <w:rPr>
+          <w:rtl w:val="0"/>
+        </w:rPr>
+        <w:t xml:space="preserve">Validar números y operación ingresada..</w:t>
+      </w:r>
+    </w:p>
+    <w:p>
+      <w:pPr>
+        <w:pStyle w:val="Heading2"/>
+        <w:rPr>
+          <w:sz w:val="22"/>
+          <w:szCs w:val="22"/>
+        </w:rPr>
+      </w:pPr>
+      <w:bookmarkStart w:colFirst="0" w:colLast="0" w:name="_uvcnne2ob3ed" w:id="10"/>
+      <w:bookmarkEnd w:id="10"/>
+      <w:r>
+        <w:rPr>
+          <w:sz w:val="22"/>
+          <w:szCs w:val="22"/>
+          <w:rtl w:val="0"/>
+        </w:rPr>
+        <w:t xml:space="preserve">Formulario validado</w:t>
+      </w:r>
+    </w:p>
+    <w:p>
+      <w:pPr>
+        <w:rPr/>
+      </w:pPr>
+      <w:r>
+        <w:rPr>
+          <w:rtl w:val="0"/>
+        </w:rPr>
+      </w:r>
+    </w:p>
+    <w:p>
+      <w:pPr>
+        <w:rPr/>
+      </w:pPr>
+      <w:r>
+        <w:rPr>
+          <w:rtl w:val="0"/>
+        </w:rPr>
+        <w:t xml:space="preserve">Enviar información desde un formulario y validar los datos a nivel de servidor.</w:t>
+      </w:r>
+    </w:p>
+    <w:p>
+      <w:pPr>
+        <w:rPr/>
+      </w:pPr>
+      <w:r>
+        <w:rPr>
+          <w:rtl w:val="0"/>
+        </w:rPr>
+        <w:t xml:space="preserve">En caso de error, mostrar los mensajes correspondientes y los datos recargados en el formulario.</w:t>
+      </w:r>
+    </w:p>
+    <w:p>
+      <w:pPr>
+        <w:rPr/>
+      </w:pPr>
+      <w:r>
+        <w:rPr>
+          <w:rtl w:val="0"/>
+        </w:rPr>
+        <w:t xml:space="preserve">Si los datos son correctos, redireccionar a otra página e informar que fueron recibidos.</w:t>
+      </w:r>
+    </w:p>
+    <w:p>
+      <w:pPr>
+        <w:ind w:left="0" w:firstLine="0"/>
+        <w:rPr/>
+      </w:pPr>
+      <w:r>
+        <w:rPr>
+          <w:rtl w:val="0"/>
+        </w:rPr>
+        <w:t xml:space="preserve">Implementar una clase que gestione los datos, incluida desde otro archivo PHP.</w:t>
+      </w:r>
+    </w:p>
+    <w:p>
+      <w:pPr>
+        <w:rPr/>
+      </w:pPr>
+      <w:r>
+        <w:rPr>
+          <w:rtl w:val="0"/>
+        </w:rPr>
+        <w:t xml:space="preserve">Datos:</w:t>
+      </w:r>
+    </w:p>
+    <w:p>
+      <w:pPr>
+        <w:numPr>
+          <w:ilvl w:val="0"/>
+          <w:numId w:val="1"/>
+        </w:numPr>
+        <w:ind w:left="720" w:hanging="360"/>
+      </w:pPr>
+      <w:r>
+        <w:rPr>
+          <w:rtl w:val="0"/>
+        </w:rPr>
+        <w:t xml:space="preserve">Nombre: requerido, hasta 50 caracteres.</w:t>
+      </w:r>
+    </w:p>
+    <w:p>
+      <w:pPr>
+        <w:numPr>
+          <w:ilvl w:val="0"/>
+          <w:numId w:val="1"/>
+        </w:numPr>
+        <w:ind w:left="720" w:hanging="360"/>
+      </w:pPr>
+      <w:r>
+        <w:rPr>
+          <w:rtl w:val="0"/>
+        </w:rPr>
+        <w:t xml:space="preserve">Dirección: requerido, hasta 100 caracteres.</w:t>
+      </w:r>
+    </w:p>
+    <w:p>
+      <w:pPr>
+        <w:numPr>
+          <w:ilvl w:val="0"/>
+          <w:numId w:val="1"/>
+        </w:numPr>
+        <w:ind w:left="720" w:hanging="360"/>
+      </w:pPr>
+      <w:r>
+        <w:rPr>
+          <w:rtl w:val="0"/>
+        </w:rPr>
+        <w:t xml:space="preserve">Teléfono: requerido, hasta 20 caracteres.</w:t>
+      </w:r>
+    </w:p>
+    <w:p>
+      <w:pPr>
+        <w:pStyle w:val="Heading2"/>
+        <w:rPr>
+          <w:sz w:val="22"/>
+          <w:szCs w:val="22"/>
+        </w:rPr>
+      </w:pPr>
+      <w:bookmarkStart w:colFirst="0" w:colLast="0" w:name="_sr1l9ko88pvh" w:id="11"/>
+      <w:bookmarkEnd w:id="11"/>
+      <w:r>
+        <w:rPr>
+          <w:sz w:val="22"/>
+          <w:szCs w:val="22"/>
+          <w:rtl w:val="0"/>
+        </w:rPr>
+        <w:t xml:space="preserve">Formulario validado (con espacios de nombres)</w:t>
+      </w:r>
+    </w:p>
+    <w:p>
+      <w:pPr>
+        <w:rPr/>
+      </w:pPr>
+      <w:r>
+        <w:rPr>
+          <w:rtl w:val="0"/>
+        </w:rPr>
+      </w:r>
+    </w:p>
+    <w:p>
+      <w:pPr>
+        <w:rPr/>
+      </w:pPr>
+      <w:r>
+        <w:rPr>
+          <w:rtl w:val="0"/>
+        </w:rPr>
+        <w:t xml:space="preserve">Implementar espacios de nombres en el ejercicio "Formulario validado".</w:t>
+      </w:r>
+    </w:p>
+    <w:p>
+      <w:pPr>
+        <w:rPr/>
+      </w:pPr>
+      <w:r>
+        <w:rPr>
+          <w:rtl w:val="0"/>
+        </w:rPr>
+      </w:r>
+    </w:p>
+    <w:p>
+      <w:pPr>
+        <w:pStyle w:val="Heading2"/>
+        <w:rPr>
+          <w:sz w:val="22"/>
+          <w:szCs w:val="22"/>
+        </w:rPr>
+      </w:pPr>
+      <w:bookmarkStart w:colFirst="0" w:colLast="0" w:name="_4zoyjkl5jcuw" w:id="12"/>
+      <w:bookmarkEnd w:id="12"/>
+      <w:r>
+        <w:rPr>
+          <w:sz w:val="22"/>
+          <w:szCs w:val="22"/>
+          <w:rtl w:val="0"/>
+        </w:rPr>
+        <w:t xml:space="preserve">Número par o impar</w:t>
+      </w:r>
+    </w:p>
+    <w:p>
+      <w:pPr>
+        <w:rPr/>
+      </w:pPr>
+      <w:r>
+        <w:rPr>
+          <w:rtl w:val="0"/>
+        </w:rPr>
+      </w:r>
+    </w:p>
+    <w:p>
+      <w:pPr>
+        <w:rPr/>
+      </w:pPr>
+      <w:r>
+        <w:rPr>
+          <w:rtl w:val="0"/>
+        </w:rPr>
+        <w:t xml:space="preserve">Ingresar un número entero entre 1 y 100 y determinar si es par o impar.</w:t>
+      </w:r>
+    </w:p>
+    <w:p>
+      <w:pPr>
+        <w:rPr/>
+      </w:pPr>
+      <w:r>
+        <w:rPr>
+          <w:rtl w:val="0"/>
+        </w:rPr>
+        <w:t xml:space="preserve">Validar el número a nivel de servidor utilizando excepciones, y mostrar mensajes personalizados.</w:t>
+      </w:r>
+    </w:p>
+    <w:p>
+      <w:pPr>
+        <w:rPr/>
+      </w:pPr>
+      <w:r>
+        <w:rPr>
+          <w:rtl w:val="0"/>
+        </w:rPr>
+        <w:t xml:space="preserve">Controlar los errores simulando un ambiente de producción.</w:t>
+      </w:r>
+    </w:p>
+    <w:p>
+      <w:pPr>
+        <w:rPr/>
+      </w:pPr>
+      <w:r>
+        <w:rPr>
+          <w:rtl w:val="0"/>
+        </w:rPr>
+        <w:t xml:space="preserve">Registrar todos los mensajes (internos y de validaciones) en un log.</w:t>
+      </w:r>
       <w:r>
         <w:rPr>
           <w:rtl w:val="0"/>
@@ -379,7 +1312,347 @@
 </file>
 
 <file path=word/numbering.xml><?xml version="1.0" encoding="utf-8"?>
-<w:numbering xmlns:mc="http://schemas.openxmlformats.org/markup-compatibility/2006" xmlns:o="urn:schemas-microsoft-com:office:office" xmlns:r="http://schemas.openxmlformats.org/officeDocument/2006/relationships" xmlns:m="http://schemas.openxmlformats.org/officeDocument/2006/math" xmlns:v="urn:schemas-microsoft-com:vml" xmlns:wp="http://schemas.openxmlformats.org/drawingml/2006/wordprocessingDrawing" xmlns:w10="urn:schemas-microsoft-com:office:word" xmlns:w="http://schemas.openxmlformats.org/wordprocessingml/2006/main" xmlns:wne="http://schemas.microsoft.com/office/word/2006/wordml" xmlns:sl="http://schemas.openxmlformats.org/schemaLibrary/2006/main" xmlns:a="http://schemas.openxmlformats.org/drawingml/2006/main" xmlns:pic="http://schemas.openxmlformats.org/drawingml/2006/picture" xmlns:c="http://schemas.openxmlformats.org/drawingml/2006/chart" xmlns:lc="http://schemas.openxmlformats.org/drawingml/2006/lockedCanvas" xmlns:dgm="http://schemas.openxmlformats.org/drawingml/2006/diagram" xmlns:wps="http://schemas.microsoft.com/office/word/2010/wordprocessingShape" xmlns:wpg="http://schemas.microsoft.com/office/word/2010/wordprocessingGroup" xmlns:w14="http://schemas.microsoft.com/office/word/2010/wordml" xmlns:w15="http://schemas.microsoft.com/office/word/2012/wordml" xmlns:w16="http://schemas.microsoft.com/office/word/2018/wordml" xmlns:w16cex="http://schemas.microsoft.com/office/word/2018/wordml/cex" xmlns:w16cid="http://schemas.microsoft.com/office/word/2016/wordml/cid" xmlns="http://schemas.microsoft.com/office/tasks/2019/documenttasks" xmlns:cr="http://schemas.microsoft.com/office/comments/2020/reactions"/>
+<w:numbering xmlns:mc="http://schemas.openxmlformats.org/markup-compatibility/2006" xmlns:o="urn:schemas-microsoft-com:office:office" xmlns:r="http://schemas.openxmlformats.org/officeDocument/2006/relationships" xmlns:m="http://schemas.openxmlformats.org/officeDocument/2006/math" xmlns:v="urn:schemas-microsoft-com:vml" xmlns:wp="http://schemas.openxmlformats.org/drawingml/2006/wordprocessingDrawing" xmlns:w10="urn:schemas-microsoft-com:office:word" xmlns:w="http://schemas.openxmlformats.org/wordprocessingml/2006/main" xmlns:wne="http://schemas.microsoft.com/office/word/2006/wordml" xmlns:sl="http://schemas.openxmlformats.org/schemaLibrary/2006/main" xmlns:a="http://schemas.openxmlformats.org/drawingml/2006/main" xmlns:pic="http://schemas.openxmlformats.org/drawingml/2006/picture" xmlns:c="http://schemas.openxmlformats.org/drawingml/2006/chart" xmlns:lc="http://schemas.openxmlformats.org/drawingml/2006/lockedCanvas" xmlns:dgm="http://schemas.openxmlformats.org/drawingml/2006/diagram" xmlns:wps="http://schemas.microsoft.com/office/word/2010/wordprocessingShape" xmlns:wpg="http://schemas.microsoft.com/office/word/2010/wordprocessingGroup" xmlns:w14="http://schemas.microsoft.com/office/word/2010/wordml" xmlns:w15="http://schemas.microsoft.com/office/word/2012/wordml" xmlns:w16="http://schemas.microsoft.com/office/word/2018/wordml" xmlns:w16cex="http://schemas.microsoft.com/office/word/2018/wordml/cex" xmlns:w16cid="http://schemas.microsoft.com/office/word/2016/wordml/cid" xmlns="http://schemas.microsoft.com/office/tasks/2019/documenttasks" xmlns:cr="http://schemas.microsoft.com/office/comments/2020/reactions">
+  <w:abstractNum w:abstractNumId="1">
+    <w:lvl w:ilvl="0">
+      <w:start w:val="1"/>
+      <w:numFmt w:val="bullet"/>
+      <w:lvlText w:val="-"/>
+      <w:lvlJc w:val="left"/>
+      <w:pPr>
+        <w:ind w:left="720" w:hanging="360"/>
+      </w:pPr>
+      <w:rPr>
+        <w:u w:val="none"/>
+      </w:rPr>
+    </w:lvl>
+    <w:lvl w:ilvl="1">
+      <w:start w:val="1"/>
+      <w:numFmt w:val="bullet"/>
+      <w:lvlText w:val="-"/>
+      <w:lvlJc w:val="left"/>
+      <w:pPr>
+        <w:ind w:left="1440" w:hanging="360"/>
+      </w:pPr>
+      <w:rPr>
+        <w:u w:val="none"/>
+      </w:rPr>
+    </w:lvl>
+    <w:lvl w:ilvl="2">
+      <w:start w:val="1"/>
+      <w:numFmt w:val="bullet"/>
+      <w:lvlText w:val="-"/>
+      <w:lvlJc w:val="left"/>
+      <w:pPr>
+        <w:ind w:left="2160" w:hanging="360"/>
+      </w:pPr>
+      <w:rPr>
+        <w:u w:val="none"/>
+      </w:rPr>
+    </w:lvl>
+    <w:lvl w:ilvl="3">
+      <w:start w:val="1"/>
+      <w:numFmt w:val="bullet"/>
+      <w:lvlText w:val="-"/>
+      <w:lvlJc w:val="left"/>
+      <w:pPr>
+        <w:ind w:left="2880" w:hanging="360"/>
+      </w:pPr>
+      <w:rPr>
+        <w:u w:val="none"/>
+      </w:rPr>
+    </w:lvl>
+    <w:lvl w:ilvl="4">
+      <w:start w:val="1"/>
+      <w:numFmt w:val="bullet"/>
+      <w:lvlText w:val="-"/>
+      <w:lvlJc w:val="left"/>
+      <w:pPr>
+        <w:ind w:left="3600" w:hanging="360"/>
+      </w:pPr>
+      <w:rPr>
+        <w:u w:val="none"/>
+      </w:rPr>
+    </w:lvl>
+    <w:lvl w:ilvl="5">
+      <w:start w:val="1"/>
+      <w:numFmt w:val="bullet"/>
+      <w:lvlText w:val="-"/>
+      <w:lvlJc w:val="left"/>
+      <w:pPr>
+        <w:ind w:left="4320" w:hanging="360"/>
+      </w:pPr>
+      <w:rPr>
+        <w:u w:val="none"/>
+      </w:rPr>
+    </w:lvl>
+    <w:lvl w:ilvl="6">
+      <w:start w:val="1"/>
+      <w:numFmt w:val="bullet"/>
+      <w:lvlText w:val="-"/>
+      <w:lvlJc w:val="left"/>
+      <w:pPr>
+        <w:ind w:left="5040" w:hanging="360"/>
+      </w:pPr>
+      <w:rPr>
+        <w:u w:val="none"/>
+      </w:rPr>
+    </w:lvl>
+    <w:lvl w:ilvl="7">
+      <w:start w:val="1"/>
+      <w:numFmt w:val="bullet"/>
+      <w:lvlText w:val="-"/>
+      <w:lvlJc w:val="left"/>
+      <w:pPr>
+        <w:ind w:left="5760" w:hanging="360"/>
+      </w:pPr>
+      <w:rPr>
+        <w:u w:val="none"/>
+      </w:rPr>
+    </w:lvl>
+    <w:lvl w:ilvl="8">
+      <w:start w:val="1"/>
+      <w:numFmt w:val="bullet"/>
+      <w:lvlText w:val="-"/>
+      <w:lvlJc w:val="left"/>
+      <w:pPr>
+        <w:ind w:left="6480" w:hanging="360"/>
+      </w:pPr>
+      <w:rPr>
+        <w:u w:val="none"/>
+      </w:rPr>
+    </w:lvl>
+  </w:abstractNum>
+  <w:abstractNum w:abstractNumId="2">
+    <w:lvl w:ilvl="0">
+      <w:start w:val="1"/>
+      <w:numFmt w:val="bullet"/>
+      <w:lvlText w:val="-"/>
+      <w:lvlJc w:val="left"/>
+      <w:pPr>
+        <w:ind w:left="720" w:hanging="360"/>
+      </w:pPr>
+      <w:rPr>
+        <w:u w:val="none"/>
+      </w:rPr>
+    </w:lvl>
+    <w:lvl w:ilvl="1">
+      <w:start w:val="1"/>
+      <w:numFmt w:val="bullet"/>
+      <w:lvlText w:val="-"/>
+      <w:lvlJc w:val="left"/>
+      <w:pPr>
+        <w:ind w:left="1440" w:hanging="360"/>
+      </w:pPr>
+      <w:rPr>
+        <w:u w:val="none"/>
+      </w:rPr>
+    </w:lvl>
+    <w:lvl w:ilvl="2">
+      <w:start w:val="1"/>
+      <w:numFmt w:val="bullet"/>
+      <w:lvlText w:val="-"/>
+      <w:lvlJc w:val="left"/>
+      <w:pPr>
+        <w:ind w:left="2160" w:hanging="360"/>
+      </w:pPr>
+      <w:rPr>
+        <w:u w:val="none"/>
+      </w:rPr>
+    </w:lvl>
+    <w:lvl w:ilvl="3">
+      <w:start w:val="1"/>
+      <w:numFmt w:val="bullet"/>
+      <w:lvlText w:val="-"/>
+      <w:lvlJc w:val="left"/>
+      <w:pPr>
+        <w:ind w:left="2880" w:hanging="360"/>
+      </w:pPr>
+      <w:rPr>
+        <w:u w:val="none"/>
+      </w:rPr>
+    </w:lvl>
+    <w:lvl w:ilvl="4">
+      <w:start w:val="1"/>
+      <w:numFmt w:val="bullet"/>
+      <w:lvlText w:val="-"/>
+      <w:lvlJc w:val="left"/>
+      <w:pPr>
+        <w:ind w:left="3600" w:hanging="360"/>
+      </w:pPr>
+      <w:rPr>
+        <w:u w:val="none"/>
+      </w:rPr>
+    </w:lvl>
+    <w:lvl w:ilvl="5">
+      <w:start w:val="1"/>
+      <w:numFmt w:val="bullet"/>
+      <w:lvlText w:val="-"/>
+      <w:lvlJc w:val="left"/>
+      <w:pPr>
+        <w:ind w:left="4320" w:hanging="360"/>
+      </w:pPr>
+      <w:rPr>
+        <w:u w:val="none"/>
+      </w:rPr>
+    </w:lvl>
+    <w:lvl w:ilvl="6">
+      <w:start w:val="1"/>
+      <w:numFmt w:val="bullet"/>
+      <w:lvlText w:val="-"/>
+      <w:lvlJc w:val="left"/>
+      <w:pPr>
+        <w:ind w:left="5040" w:hanging="360"/>
+      </w:pPr>
+      <w:rPr>
+        <w:u w:val="none"/>
+      </w:rPr>
+    </w:lvl>
+    <w:lvl w:ilvl="7">
+      <w:start w:val="1"/>
+      <w:numFmt w:val="bullet"/>
+      <w:lvlText w:val="-"/>
+      <w:lvlJc w:val="left"/>
+      <w:pPr>
+        <w:ind w:left="5760" w:hanging="360"/>
+      </w:pPr>
+      <w:rPr>
+        <w:u w:val="none"/>
+      </w:rPr>
+    </w:lvl>
+    <w:lvl w:ilvl="8">
+      <w:start w:val="1"/>
+      <w:numFmt w:val="bullet"/>
+      <w:lvlText w:val="-"/>
+      <w:lvlJc w:val="left"/>
+      <w:pPr>
+        <w:ind w:left="6480" w:hanging="360"/>
+      </w:pPr>
+      <w:rPr>
+        <w:u w:val="none"/>
+      </w:rPr>
+    </w:lvl>
+  </w:abstractNum>
+  <w:abstractNum w:abstractNumId="3">
+    <w:lvl w:ilvl="0">
+      <w:start w:val="1"/>
+      <w:numFmt w:val="bullet"/>
+      <w:lvlText w:val="-"/>
+      <w:lvlJc w:val="left"/>
+      <w:pPr>
+        <w:ind w:left="720" w:hanging="360"/>
+      </w:pPr>
+      <w:rPr>
+        <w:u w:val="none"/>
+      </w:rPr>
+    </w:lvl>
+    <w:lvl w:ilvl="1">
+      <w:start w:val="1"/>
+      <w:numFmt w:val="bullet"/>
+      <w:lvlText w:val="-"/>
+      <w:lvlJc w:val="left"/>
+      <w:pPr>
+        <w:ind w:left="1440" w:hanging="360"/>
+      </w:pPr>
+      <w:rPr>
+        <w:u w:val="none"/>
+      </w:rPr>
+    </w:lvl>
+    <w:lvl w:ilvl="2">
+      <w:start w:val="1"/>
+      <w:numFmt w:val="bullet"/>
+      <w:lvlText w:val="-"/>
+      <w:lvlJc w:val="left"/>
+      <w:pPr>
+        <w:ind w:left="2160" w:hanging="360"/>
+      </w:pPr>
+      <w:rPr>
+        <w:u w:val="none"/>
+      </w:rPr>
+    </w:lvl>
+    <w:lvl w:ilvl="3">
+      <w:start w:val="1"/>
+      <w:numFmt w:val="bullet"/>
+      <w:lvlText w:val="-"/>
+      <w:lvlJc w:val="left"/>
+      <w:pPr>
+        <w:ind w:left="2880" w:hanging="360"/>
+      </w:pPr>
+      <w:rPr>
+        <w:u w:val="none"/>
+      </w:rPr>
+    </w:lvl>
+    <w:lvl w:ilvl="4">
+      <w:start w:val="1"/>
+      <w:numFmt w:val="bullet"/>
+      <w:lvlText w:val="-"/>
+      <w:lvlJc w:val="left"/>
+      <w:pPr>
+        <w:ind w:left="3600" w:hanging="360"/>
+      </w:pPr>
+      <w:rPr>
+        <w:u w:val="none"/>
+      </w:rPr>
+    </w:lvl>
+    <w:lvl w:ilvl="5">
+      <w:start w:val="1"/>
+      <w:numFmt w:val="bullet"/>
+      <w:lvlText w:val="-"/>
+      <w:lvlJc w:val="left"/>
+      <w:pPr>
+        <w:ind w:left="4320" w:hanging="360"/>
+      </w:pPr>
+      <w:rPr>
+        <w:u w:val="none"/>
+      </w:rPr>
+    </w:lvl>
+    <w:lvl w:ilvl="6">
+      <w:start w:val="1"/>
+      <w:numFmt w:val="bullet"/>
+      <w:lvlText w:val="-"/>
+      <w:lvlJc w:val="left"/>
+      <w:pPr>
+        <w:ind w:left="5040" w:hanging="360"/>
+      </w:pPr>
+      <w:rPr>
+        <w:u w:val="none"/>
+      </w:rPr>
+    </w:lvl>
+    <w:lvl w:ilvl="7">
+      <w:start w:val="1"/>
+      <w:numFmt w:val="bullet"/>
+      <w:lvlText w:val="-"/>
+      <w:lvlJc w:val="left"/>
+      <w:pPr>
+        <w:ind w:left="5760" w:hanging="360"/>
+      </w:pPr>
+      <w:rPr>
+        <w:u w:val="none"/>
+      </w:rPr>
+    </w:lvl>
+    <w:lvl w:ilvl="8">
+      <w:start w:val="1"/>
+      <w:numFmt w:val="bullet"/>
+      <w:lvlText w:val="-"/>
+      <w:lvlJc w:val="left"/>
+      <w:pPr>
+        <w:ind w:left="6480" w:hanging="360"/>
+      </w:pPr>
+      <w:rPr>
+        <w:u w:val="none"/>
+      </w:rPr>
+    </w:lvl>
+  </w:abstractNum>
+  <w:num w:numId="1">
+    <w:abstractNumId w:val="1"/>
+  </w:num>
+  <w:num w:numId="2">
+    <w:abstractNumId w:val="2"/>
+  </w:num>
+  <w:num w:numId="3">
+    <w:abstractNumId w:val="3"/>
+  </w:num>
+</w:numbering>
 </file>
 
 <file path=word/styles.xml><?xml version="1.0" encoding="utf-8"?>

</xml_diff>

<commit_message>
Completado el ejercicio de formulario-validacion. Falta testear.
</commit_message>
<xml_diff>
--- a/consignas/php-ejercicios.docx
+++ b/consignas/php-ejercicios.docx
@@ -510,7 +510,7 @@
       <w:pPr>
         <w:numPr>
           <w:ilvl w:val="0"/>
-          <w:numId w:val="3"/>
+          <w:numId w:val="4"/>
         </w:numPr>
         <w:ind w:left="720" w:hanging="360"/>
       </w:pPr>
@@ -519,6 +519,486 @@
           <w:rtl w:val="0"/>
         </w:rPr>
         <w:t xml:space="preserve">El promedio por alumno.</w:t>
+      </w:r>
+    </w:p>
+    <w:p>
+      <w:pPr>
+        <w:numPr>
+          <w:ilvl w:val="0"/>
+          <w:numId w:val="4"/>
+        </w:numPr>
+        <w:ind w:left="720" w:hanging="360"/>
+      </w:pPr>
+      <w:r>
+        <w:rPr>
+          <w:rtl w:val="0"/>
+        </w:rPr>
+        <w:t xml:space="preserve">La nota más alta y la más baja.</w:t>
+      </w:r>
+    </w:p>
+    <w:p>
+      <w:pPr>
+        <w:numPr>
+          <w:ilvl w:val="0"/>
+          <w:numId w:val="4"/>
+        </w:numPr>
+        <w:ind w:left="720" w:hanging="360"/>
+      </w:pPr>
+      <w:r>
+        <w:rPr>
+          <w:rtl w:val="0"/>
+        </w:rPr>
+        <w:t xml:space="preserve">El promedio más alto y el más bajo.</w:t>
+      </w:r>
+    </w:p>
+    <w:p>
+      <w:pPr>
+        <w:rPr/>
+      </w:pPr>
+      <w:r>
+        <w:rPr>
+          <w:rtl w:val="0"/>
+        </w:rPr>
+        <w:t xml:space="preserve">Implementar funciones definidas por el usuario e internas de PHP.</w:t>
+      </w:r>
+    </w:p>
+    <w:p>
+      <w:pPr>
+        <w:pStyle w:val="Heading2"/>
+        <w:rPr>
+          <w:sz w:val="22"/>
+          <w:szCs w:val="22"/>
+        </w:rPr>
+      </w:pPr>
+      <w:bookmarkStart w:colFirst="0" w:colLast="0" w:name="_xb2q3z43qbof" w:id="8"/>
+      <w:bookmarkEnd w:id="8"/>
+      <w:r>
+        <w:rPr>
+          <w:sz w:val="22"/>
+          <w:szCs w:val="22"/>
+          <w:rtl w:val="0"/>
+        </w:rPr>
+        <w:t xml:space="preserve">Sorteo de nombres</w:t>
+      </w:r>
+    </w:p>
+    <w:p>
+      <w:pPr>
+        <w:rPr/>
+      </w:pPr>
+      <w:r>
+        <w:rPr>
+          <w:rtl w:val="0"/>
+        </w:rPr>
+      </w:r>
+    </w:p>
+    <w:p>
+      <w:pPr>
+        <w:rPr/>
+      </w:pPr>
+      <w:r>
+        <w:rPr>
+          <w:rtl w:val="0"/>
+        </w:rPr>
+        <w:t xml:space="preserve">Hacer una página que permita ingresar un conjunto de nombres separados por coma (,) y luego realizar un sorteo, donde se listen los nombres ordenados de forma aleatoria.</w:t>
+      </w:r>
+    </w:p>
+    <w:p>
+      <w:pPr>
+        <w:rPr/>
+      </w:pPr>
+      <w:r>
+        <w:rPr>
+          <w:rtl w:val="0"/>
+        </w:rPr>
+        <w:t xml:space="preserve">Validar los datos ingresados, e informar errores.</w:t>
+      </w:r>
+    </w:p>
+    <w:p>
+      <w:pPr>
+        <w:rPr/>
+      </w:pPr>
+      <w:r>
+        <w:rPr>
+          <w:rtl w:val="0"/>
+        </w:rPr>
+        <w:t xml:space="preserve">Implementar funciones definidas por el usuario e internas de PHP.</w:t>
+      </w:r>
+    </w:p>
+    <w:p>
+      <w:pPr>
+        <w:pStyle w:val="Heading2"/>
+        <w:rPr>
+          <w:sz w:val="22"/>
+          <w:szCs w:val="22"/>
+        </w:rPr>
+      </w:pPr>
+      <w:bookmarkStart w:colFirst="0" w:colLast="0" w:name="_f0jt179vflzw" w:id="9"/>
+      <w:bookmarkEnd w:id="9"/>
+      <w:r>
+        <w:rPr>
+          <w:sz w:val="22"/>
+          <w:szCs w:val="22"/>
+          <w:rtl w:val="0"/>
+        </w:rPr>
+        <w:t xml:space="preserve">Calculadora</w:t>
+      </w:r>
+    </w:p>
+    <w:p>
+      <w:pPr>
+        <w:rPr/>
+      </w:pPr>
+      <w:r>
+        <w:rPr>
+          <w:rtl w:val="0"/>
+        </w:rPr>
+      </w:r>
+    </w:p>
+    <w:p>
+      <w:pPr>
+        <w:rPr/>
+      </w:pPr>
+      <w:r>
+        <w:rPr>
+          <w:rtl w:val="0"/>
+        </w:rPr>
+        <w:t xml:space="preserve">Hacer un formulario que permita ingresar dos valores y realizar la suma, resta,</w:t>
+      </w:r>
+    </w:p>
+    <w:p>
+      <w:pPr>
+        <w:rPr/>
+      </w:pPr>
+      <w:r>
+        <w:rPr>
+          <w:rtl w:val="0"/>
+        </w:rPr>
+        <w:t xml:space="preserve">multiplicación o división de los mismos.  </w:t>
+      </w:r>
+    </w:p>
+    <w:p>
+      <w:pPr>
+        <w:rPr/>
+      </w:pPr>
+      <w:r>
+        <w:rPr>
+          <w:rtl w:val="0"/>
+        </w:rPr>
+        <w:t xml:space="preserve">Mostrar en otra página la operación realizada y el resultado obtenido.</w:t>
+      </w:r>
+    </w:p>
+    <w:p>
+      <w:pPr>
+        <w:rPr/>
+      </w:pPr>
+      <w:r>
+        <w:rPr>
+          <w:rtl w:val="0"/>
+        </w:rPr>
+        <w:t xml:space="preserve">Implementar una clase que gestione los datos y cálculos, incluida desde otro archivo PHP.</w:t>
+      </w:r>
+    </w:p>
+    <w:p>
+      <w:pPr>
+        <w:rPr/>
+      </w:pPr>
+      <w:r>
+        <w:rPr>
+          <w:rtl w:val="0"/>
+        </w:rPr>
+        <w:t xml:space="preserve">Validar números y operación ingresada..</w:t>
+      </w:r>
+    </w:p>
+    <w:p>
+      <w:pPr>
+        <w:pStyle w:val="Heading2"/>
+        <w:rPr>
+          <w:sz w:val="22"/>
+          <w:szCs w:val="22"/>
+        </w:rPr>
+      </w:pPr>
+      <w:bookmarkStart w:colFirst="0" w:colLast="0" w:name="_uvcnne2ob3ed" w:id="10"/>
+      <w:bookmarkEnd w:id="10"/>
+      <w:r>
+        <w:rPr>
+          <w:sz w:val="22"/>
+          <w:szCs w:val="22"/>
+          <w:rtl w:val="0"/>
+        </w:rPr>
+        <w:t xml:space="preserve">Formulario validado</w:t>
+      </w:r>
+    </w:p>
+    <w:p>
+      <w:pPr>
+        <w:rPr/>
+      </w:pPr>
+      <w:r>
+        <w:rPr>
+          <w:rtl w:val="0"/>
+        </w:rPr>
+      </w:r>
+    </w:p>
+    <w:p>
+      <w:pPr>
+        <w:rPr/>
+      </w:pPr>
+      <w:r>
+        <w:rPr>
+          <w:rtl w:val="0"/>
+        </w:rPr>
+        <w:t xml:space="preserve">Enviar información desde un formulario y validar los datos a nivel de servidor.</w:t>
+      </w:r>
+    </w:p>
+    <w:p>
+      <w:pPr>
+        <w:rPr/>
+      </w:pPr>
+      <w:r>
+        <w:rPr>
+          <w:rtl w:val="0"/>
+        </w:rPr>
+        <w:t xml:space="preserve">En caso de error, mostrar los mensajes correspondientes y los datos recargados en el formulario.</w:t>
+      </w:r>
+    </w:p>
+    <w:p>
+      <w:pPr>
+        <w:rPr/>
+      </w:pPr>
+      <w:r>
+        <w:rPr>
+          <w:rtl w:val="0"/>
+        </w:rPr>
+        <w:t xml:space="preserve">Si los datos son correctos, redireccionar a otra página e informar que fueron recibidos.</w:t>
+      </w:r>
+    </w:p>
+    <w:p>
+      <w:pPr>
+        <w:ind w:left="0" w:firstLine="0"/>
+        <w:rPr/>
+      </w:pPr>
+      <w:r>
+        <w:rPr>
+          <w:rtl w:val="0"/>
+        </w:rPr>
+        <w:t xml:space="preserve">Implementar una clase que gestione los datos, incluida desde otro archivo PHP.</w:t>
+      </w:r>
+    </w:p>
+    <w:p>
+      <w:pPr>
+        <w:rPr/>
+      </w:pPr>
+      <w:r>
+        <w:rPr>
+          <w:rtl w:val="0"/>
+        </w:rPr>
+        <w:t xml:space="preserve">Datos:</w:t>
+      </w:r>
+    </w:p>
+    <w:p>
+      <w:pPr>
+        <w:numPr>
+          <w:ilvl w:val="0"/>
+          <w:numId w:val="1"/>
+        </w:numPr>
+        <w:ind w:left="720" w:hanging="360"/>
+      </w:pPr>
+      <w:r>
+        <w:rPr>
+          <w:rtl w:val="0"/>
+        </w:rPr>
+        <w:t xml:space="preserve">Nombre: requerido, hasta 50 caracteres.</w:t>
+      </w:r>
+    </w:p>
+    <w:p>
+      <w:pPr>
+        <w:numPr>
+          <w:ilvl w:val="0"/>
+          <w:numId w:val="1"/>
+        </w:numPr>
+        <w:ind w:left="720" w:hanging="360"/>
+      </w:pPr>
+      <w:r>
+        <w:rPr>
+          <w:rtl w:val="0"/>
+        </w:rPr>
+        <w:t xml:space="preserve">Dirección: requerido, hasta 100 caracteres.</w:t>
+      </w:r>
+    </w:p>
+    <w:p>
+      <w:pPr>
+        <w:numPr>
+          <w:ilvl w:val="0"/>
+          <w:numId w:val="1"/>
+        </w:numPr>
+        <w:ind w:left="720" w:hanging="360"/>
+      </w:pPr>
+      <w:r>
+        <w:rPr>
+          <w:rtl w:val="0"/>
+        </w:rPr>
+        <w:t xml:space="preserve">Teléfono: requerido, hasta 20 caracteres.</w:t>
+      </w:r>
+    </w:p>
+    <w:p>
+      <w:pPr>
+        <w:pStyle w:val="Heading2"/>
+        <w:rPr>
+          <w:sz w:val="22"/>
+          <w:szCs w:val="22"/>
+        </w:rPr>
+      </w:pPr>
+      <w:bookmarkStart w:colFirst="0" w:colLast="0" w:name="_sr1l9ko88pvh" w:id="11"/>
+      <w:bookmarkEnd w:id="11"/>
+      <w:r>
+        <w:rPr>
+          <w:sz w:val="22"/>
+          <w:szCs w:val="22"/>
+          <w:rtl w:val="0"/>
+        </w:rPr>
+        <w:t xml:space="preserve">Formulario validado (con espacios de nombres)</w:t>
+      </w:r>
+    </w:p>
+    <w:p>
+      <w:pPr>
+        <w:rPr/>
+      </w:pPr>
+      <w:r>
+        <w:rPr>
+          <w:rtl w:val="0"/>
+        </w:rPr>
+      </w:r>
+    </w:p>
+    <w:p>
+      <w:pPr>
+        <w:rPr/>
+      </w:pPr>
+      <w:r>
+        <w:rPr>
+          <w:rtl w:val="0"/>
+        </w:rPr>
+        <w:t xml:space="preserve">Implementar espacios de nombres en el ejercicio "Formulario validado".</w:t>
+      </w:r>
+    </w:p>
+    <w:p>
+      <w:pPr>
+        <w:rPr/>
+      </w:pPr>
+      <w:r>
+        <w:rPr>
+          <w:rtl w:val="0"/>
+        </w:rPr>
+      </w:r>
+    </w:p>
+    <w:p>
+      <w:pPr>
+        <w:pStyle w:val="Heading2"/>
+        <w:rPr>
+          <w:sz w:val="22"/>
+          <w:szCs w:val="22"/>
+        </w:rPr>
+      </w:pPr>
+      <w:bookmarkStart w:colFirst="0" w:colLast="0" w:name="_4zoyjkl5jcuw" w:id="12"/>
+      <w:bookmarkEnd w:id="12"/>
+      <w:r>
+        <w:rPr>
+          <w:sz w:val="22"/>
+          <w:szCs w:val="22"/>
+          <w:rtl w:val="0"/>
+        </w:rPr>
+        <w:t xml:space="preserve">Número par o impar</w:t>
+      </w:r>
+    </w:p>
+    <w:p>
+      <w:pPr>
+        <w:rPr/>
+      </w:pPr>
+      <w:r>
+        <w:rPr>
+          <w:rtl w:val="0"/>
+        </w:rPr>
+      </w:r>
+    </w:p>
+    <w:p>
+      <w:pPr>
+        <w:rPr/>
+      </w:pPr>
+      <w:r>
+        <w:rPr>
+          <w:rtl w:val="0"/>
+        </w:rPr>
+        <w:t xml:space="preserve">Ingresar un número entero entre 1 y 100 y determinar si es par o impar.</w:t>
+      </w:r>
+    </w:p>
+    <w:p>
+      <w:pPr>
+        <w:rPr/>
+      </w:pPr>
+      <w:r>
+        <w:rPr>
+          <w:rtl w:val="0"/>
+        </w:rPr>
+        <w:t xml:space="preserve">Validar el número a nivel de servidor utilizando excepciones, y mostrar mensajes personalizados.</w:t>
+      </w:r>
+    </w:p>
+    <w:p>
+      <w:pPr>
+        <w:rPr/>
+      </w:pPr>
+      <w:r>
+        <w:rPr>
+          <w:rtl w:val="0"/>
+        </w:rPr>
+        <w:t xml:space="preserve">Controlar los errores simulando un ambiente de producción.</w:t>
+      </w:r>
+    </w:p>
+    <w:p>
+      <w:pPr>
+        <w:rPr/>
+      </w:pPr>
+      <w:r>
+        <w:rPr>
+          <w:rtl w:val="0"/>
+        </w:rPr>
+        <w:t xml:space="preserve">Registrar todos los mensajes (internos y de validaciones) en un log.</w:t>
+      </w:r>
+    </w:p>
+    <w:p>
+      <w:pPr>
+        <w:pStyle w:val="Heading2"/>
+        <w:rPr>
+          <w:sz w:val="22"/>
+          <w:szCs w:val="22"/>
+        </w:rPr>
+      </w:pPr>
+      <w:bookmarkStart w:colFirst="0" w:colLast="0" w:name="_3psa5hz06sbf" w:id="13"/>
+      <w:bookmarkEnd w:id="13"/>
+      <w:r>
+        <w:rPr>
+          <w:sz w:val="22"/>
+          <w:szCs w:val="22"/>
+          <w:rtl w:val="0"/>
+        </w:rPr>
+        <w:t xml:space="preserve">Listado de clientes</w:t>
+      </w:r>
+    </w:p>
+    <w:p>
+      <w:pPr>
+        <w:rPr/>
+      </w:pPr>
+      <w:r>
+        <w:rPr>
+          <w:rtl w:val="0"/>
+        </w:rPr>
+      </w:r>
+    </w:p>
+    <w:p>
+      <w:pPr>
+        <w:rPr/>
+      </w:pPr>
+      <w:r>
+        <w:rPr>
+          <w:rtl w:val="0"/>
+        </w:rPr>
+        <w:t xml:space="preserve">Crear una base de datos con 2 tablas:</w:t>
       </w:r>
     </w:p>
     <w:p>
@@ -533,7 +1013,7 @@
         <w:rPr>
           <w:rtl w:val="0"/>
         </w:rPr>
-        <w:t xml:space="preserve">La nota más alta y la más baja.</w:t>
+        <w:t xml:space="preserve">Localidades: id y nombre.</w:t>
       </w:r>
     </w:p>
     <w:p>
@@ -548,18 +1028,51 @@
         <w:rPr>
           <w:rtl w:val="0"/>
         </w:rPr>
-        <w:t xml:space="preserve">El promedio más alto y el más bajo.</w:t>
-      </w:r>
-    </w:p>
-    <w:p>
-      <w:pPr>
-        <w:rPr/>
-      </w:pPr>
-      <w:r>
-        <w:rPr>
-          <w:rtl w:val="0"/>
-        </w:rPr>
-        <w:t xml:space="preserve">Implementar funciones definidas por el usuario e internas de PHP.</w:t>
+        <w:t xml:space="preserve">Clientes: id, nombre, dirección, localidad y teléfono.</w:t>
+      </w:r>
+    </w:p>
+    <w:p>
+      <w:pPr>
+        <w:rPr/>
+      </w:pPr>
+      <w:r>
+        <w:rPr>
+          <w:rtl w:val="0"/>
+        </w:rPr>
+        <w:t xml:space="preserve">Una localidad puede tener 0 o muchos clientes y un cliente pertenece a una sola localidad.</w:t>
+      </w:r>
+    </w:p>
+    <w:p>
+      <w:pPr>
+        <w:rPr/>
+      </w:pPr>
+      <w:r>
+        <w:rPr>
+          <w:rtl w:val="0"/>
+        </w:rPr>
+        <w:t xml:space="preserve">Crear un script.sql para insertar los datos.</w:t>
+      </w:r>
+    </w:p>
+    <w:p>
+      <w:pPr>
+        <w:rPr/>
+      </w:pPr>
+      <w:r>
+        <w:rPr>
+          <w:rtl w:val="0"/>
+        </w:rPr>
+        <w:t xml:space="preserve">Mostrar en una página el listado ordenado por localidad y cliente. </w:t>
+      </w:r>
+    </w:p>
+    <w:p>
+      <w:pPr>
+        <w:rPr/>
+      </w:pPr>
+      <w:r>
+        <w:rPr>
+          <w:rtl w:val="0"/>
+        </w:rPr>
+        <w:t xml:space="preserve">También se debe mostrar el total de registros encontrados.</w:t>
       </w:r>
     </w:p>
     <w:p>
@@ -570,373 +1083,47 @@
           <w:szCs w:val="22"/>
         </w:rPr>
       </w:pPr>
-      <w:bookmarkStart w:colFirst="0" w:colLast="0" w:name="_xb2q3z43qbof" w:id="8"/>
-      <w:bookmarkEnd w:id="8"/>
-      <w:r>
-        <w:rPr>
-          <w:sz w:val="22"/>
-          <w:szCs w:val="22"/>
-          <w:rtl w:val="0"/>
-        </w:rPr>
-        <w:t xml:space="preserve">Sorteo de nombres</w:t>
-      </w:r>
-    </w:p>
-    <w:p>
-      <w:pPr>
-        <w:rPr/>
-      </w:pPr>
-      <w:r>
-        <w:rPr>
-          <w:rtl w:val="0"/>
-        </w:rPr>
-      </w:r>
-    </w:p>
-    <w:p>
-      <w:pPr>
-        <w:rPr/>
-      </w:pPr>
-      <w:r>
-        <w:rPr>
-          <w:rtl w:val="0"/>
-        </w:rPr>
-        <w:t xml:space="preserve">Hacer una página que permita ingresar un conjunto de nombres separados por coma (,) y luego realizar un sorteo, donde se listen los nombres ordenados de forma aleatoria.</w:t>
-      </w:r>
-    </w:p>
-    <w:p>
-      <w:pPr>
-        <w:rPr/>
-      </w:pPr>
-      <w:r>
-        <w:rPr>
-          <w:rtl w:val="0"/>
-        </w:rPr>
-        <w:t xml:space="preserve">Validar los datos ingresados, e informar errores.</w:t>
-      </w:r>
-    </w:p>
-    <w:p>
-      <w:pPr>
-        <w:rPr/>
-      </w:pPr>
-      <w:r>
-        <w:rPr>
-          <w:rtl w:val="0"/>
-        </w:rPr>
-        <w:t xml:space="preserve">Implementar funciones definidas por el usuario e internas de PHP.</w:t>
-      </w:r>
-    </w:p>
-    <w:p>
-      <w:pPr>
-        <w:pStyle w:val="Heading2"/>
-        <w:rPr>
-          <w:sz w:val="22"/>
-          <w:szCs w:val="22"/>
-        </w:rPr>
-      </w:pPr>
-      <w:bookmarkStart w:colFirst="0" w:colLast="0" w:name="_f0jt179vflzw" w:id="9"/>
-      <w:bookmarkEnd w:id="9"/>
-      <w:r>
-        <w:rPr>
-          <w:sz w:val="22"/>
-          <w:szCs w:val="22"/>
-          <w:rtl w:val="0"/>
-        </w:rPr>
-        <w:t xml:space="preserve">Calculadora</w:t>
-      </w:r>
-    </w:p>
-    <w:p>
-      <w:pPr>
-        <w:rPr/>
-      </w:pPr>
-      <w:r>
-        <w:rPr>
-          <w:rtl w:val="0"/>
-        </w:rPr>
-      </w:r>
-    </w:p>
-    <w:p>
-      <w:pPr>
-        <w:rPr/>
-      </w:pPr>
-      <w:r>
-        <w:rPr>
-          <w:rtl w:val="0"/>
-        </w:rPr>
-        <w:t xml:space="preserve">Hacer un formulario que permita ingresar dos valores y realizar la suma, resta,</w:t>
-      </w:r>
-    </w:p>
-    <w:p>
-      <w:pPr>
-        <w:rPr/>
-      </w:pPr>
-      <w:r>
-        <w:rPr>
-          <w:rtl w:val="0"/>
-        </w:rPr>
-        <w:t xml:space="preserve">multiplicación o división de los mismos.  </w:t>
-      </w:r>
-    </w:p>
-    <w:p>
-      <w:pPr>
-        <w:rPr/>
-      </w:pPr>
-      <w:r>
-        <w:rPr>
-          <w:rtl w:val="0"/>
-        </w:rPr>
-        <w:t xml:space="preserve">Mostrar en otra página la operación realizada y el resultado obtenido.</w:t>
-      </w:r>
-    </w:p>
-    <w:p>
-      <w:pPr>
-        <w:rPr/>
-      </w:pPr>
-      <w:r>
-        <w:rPr>
-          <w:rtl w:val="0"/>
-        </w:rPr>
-        <w:t xml:space="preserve">Implementar una clase que gestione los datos y cálculos, incluida desde otro archivo PHP.</w:t>
-      </w:r>
-    </w:p>
-    <w:p>
-      <w:pPr>
-        <w:rPr/>
-      </w:pPr>
-      <w:r>
-        <w:rPr>
-          <w:rtl w:val="0"/>
-        </w:rPr>
-        <w:t xml:space="preserve">Validar números y operación ingresada..</w:t>
-      </w:r>
-    </w:p>
-    <w:p>
-      <w:pPr>
-        <w:pStyle w:val="Heading2"/>
-        <w:rPr>
-          <w:sz w:val="22"/>
-          <w:szCs w:val="22"/>
-        </w:rPr>
-      </w:pPr>
-      <w:bookmarkStart w:colFirst="0" w:colLast="0" w:name="_uvcnne2ob3ed" w:id="10"/>
-      <w:bookmarkEnd w:id="10"/>
-      <w:r>
-        <w:rPr>
-          <w:sz w:val="22"/>
-          <w:szCs w:val="22"/>
-          <w:rtl w:val="0"/>
-        </w:rPr>
-        <w:t xml:space="preserve">Formulario validado</w:t>
-      </w:r>
-    </w:p>
-    <w:p>
-      <w:pPr>
-        <w:rPr/>
-      </w:pPr>
-      <w:r>
-        <w:rPr>
-          <w:rtl w:val="0"/>
-        </w:rPr>
-      </w:r>
-    </w:p>
-    <w:p>
-      <w:pPr>
-        <w:rPr/>
-      </w:pPr>
-      <w:r>
-        <w:rPr>
-          <w:rtl w:val="0"/>
-        </w:rPr>
-        <w:t xml:space="preserve">Enviar información desde un formulario y validar los datos a nivel de servidor.</w:t>
-      </w:r>
-    </w:p>
-    <w:p>
-      <w:pPr>
-        <w:rPr/>
-      </w:pPr>
-      <w:r>
-        <w:rPr>
-          <w:rtl w:val="0"/>
-        </w:rPr>
-        <w:t xml:space="preserve">En caso de error, mostrar los mensajes correspondientes y los datos recargados en el formulario.</w:t>
-      </w:r>
-    </w:p>
-    <w:p>
-      <w:pPr>
-        <w:rPr/>
-      </w:pPr>
-      <w:r>
-        <w:rPr>
-          <w:rtl w:val="0"/>
-        </w:rPr>
-        <w:t xml:space="preserve">Si los datos son correctos, redireccionar a otra página e informar que fueron recibidos.</w:t>
-      </w:r>
-    </w:p>
-    <w:p>
-      <w:pPr>
-        <w:ind w:left="0" w:firstLine="0"/>
-        <w:rPr/>
-      </w:pPr>
-      <w:r>
-        <w:rPr>
-          <w:rtl w:val="0"/>
-        </w:rPr>
-        <w:t xml:space="preserve">Implementar una clase que gestione los datos, incluida desde otro archivo PHP.</w:t>
-      </w:r>
-    </w:p>
-    <w:p>
-      <w:pPr>
-        <w:rPr/>
-      </w:pPr>
-      <w:r>
-        <w:rPr>
-          <w:rtl w:val="0"/>
-        </w:rPr>
-        <w:t xml:space="preserve">Datos:</w:t>
-      </w:r>
-    </w:p>
-    <w:p>
-      <w:pPr>
-        <w:numPr>
-          <w:ilvl w:val="0"/>
-          <w:numId w:val="1"/>
-        </w:numPr>
-        <w:ind w:left="720" w:hanging="360"/>
-      </w:pPr>
-      <w:r>
-        <w:rPr>
-          <w:rtl w:val="0"/>
-        </w:rPr>
-        <w:t xml:space="preserve">Nombre: requerido, hasta 50 caracteres.</w:t>
-      </w:r>
-    </w:p>
-    <w:p>
-      <w:pPr>
-        <w:numPr>
-          <w:ilvl w:val="0"/>
-          <w:numId w:val="1"/>
-        </w:numPr>
-        <w:ind w:left="720" w:hanging="360"/>
-      </w:pPr>
-      <w:r>
-        <w:rPr>
-          <w:rtl w:val="0"/>
-        </w:rPr>
-        <w:t xml:space="preserve">Dirección: requerido, hasta 100 caracteres.</w:t>
-      </w:r>
-    </w:p>
-    <w:p>
-      <w:pPr>
-        <w:numPr>
-          <w:ilvl w:val="0"/>
-          <w:numId w:val="1"/>
-        </w:numPr>
-        <w:ind w:left="720" w:hanging="360"/>
-      </w:pPr>
-      <w:r>
-        <w:rPr>
-          <w:rtl w:val="0"/>
-        </w:rPr>
-        <w:t xml:space="preserve">Teléfono: requerido, hasta 20 caracteres.</w:t>
-      </w:r>
-    </w:p>
-    <w:p>
-      <w:pPr>
-        <w:pStyle w:val="Heading2"/>
-        <w:rPr>
-          <w:sz w:val="22"/>
-          <w:szCs w:val="22"/>
-        </w:rPr>
-      </w:pPr>
-      <w:bookmarkStart w:colFirst="0" w:colLast="0" w:name="_sr1l9ko88pvh" w:id="11"/>
-      <w:bookmarkEnd w:id="11"/>
-      <w:r>
-        <w:rPr>
-          <w:sz w:val="22"/>
-          <w:szCs w:val="22"/>
-          <w:rtl w:val="0"/>
-        </w:rPr>
-        <w:t xml:space="preserve">Formulario validado (con espacios de nombres)</w:t>
-      </w:r>
-    </w:p>
-    <w:p>
-      <w:pPr>
-        <w:rPr/>
-      </w:pPr>
-      <w:r>
-        <w:rPr>
-          <w:rtl w:val="0"/>
-        </w:rPr>
-      </w:r>
-    </w:p>
-    <w:p>
-      <w:pPr>
-        <w:rPr/>
-      </w:pPr>
-      <w:r>
-        <w:rPr>
-          <w:rtl w:val="0"/>
-        </w:rPr>
-        <w:t xml:space="preserve">Implementar espacios de nombres en el ejercicio "Formulario validado".</w:t>
-      </w:r>
-    </w:p>
-    <w:p>
-      <w:pPr>
-        <w:rPr/>
-      </w:pPr>
-      <w:r>
-        <w:rPr>
-          <w:rtl w:val="0"/>
-        </w:rPr>
-      </w:r>
-    </w:p>
-    <w:p>
-      <w:pPr>
-        <w:pStyle w:val="Heading2"/>
-        <w:rPr>
-          <w:sz w:val="22"/>
-          <w:szCs w:val="22"/>
-        </w:rPr>
-      </w:pPr>
-      <w:bookmarkStart w:colFirst="0" w:colLast="0" w:name="_4zoyjkl5jcuw" w:id="12"/>
-      <w:bookmarkEnd w:id="12"/>
-      <w:r>
-        <w:rPr>
-          <w:sz w:val="22"/>
-          <w:szCs w:val="22"/>
-          <w:rtl w:val="0"/>
-        </w:rPr>
-        <w:t xml:space="preserve">Número par o impar</w:t>
-      </w:r>
-    </w:p>
-    <w:p>
-      <w:pPr>
-        <w:rPr/>
-      </w:pPr>
-      <w:r>
-        <w:rPr>
-          <w:rtl w:val="0"/>
-        </w:rPr>
-      </w:r>
-    </w:p>
-    <w:p>
-      <w:pPr>
-        <w:rPr/>
-      </w:pPr>
-      <w:r>
-        <w:rPr>
-          <w:rtl w:val="0"/>
-        </w:rPr>
-        <w:t xml:space="preserve">Ingresar un número entero entre 1 y 100 y determinar si es par o impar.</w:t>
-      </w:r>
-    </w:p>
-    <w:p>
-      <w:pPr>
-        <w:rPr/>
-      </w:pPr>
-      <w:r>
-        <w:rPr>
-          <w:rtl w:val="0"/>
-        </w:rPr>
-        <w:t xml:space="preserve">Validar el número a nivel de servidor utilizando excepciones, y mostrar mensajes personalizados.</w:t>
+      <w:bookmarkStart w:colFirst="0" w:colLast="0" w:name="_cqqh2a73v68m" w:id="14"/>
+      <w:bookmarkEnd w:id="14"/>
+      <w:r>
+        <w:rPr>
+          <w:sz w:val="22"/>
+          <w:szCs w:val="22"/>
+          <w:rtl w:val="0"/>
+        </w:rPr>
+        <w:t xml:space="preserve">Búsqueda de clientes</w:t>
+      </w:r>
+    </w:p>
+    <w:p>
+      <w:pPr>
+        <w:rPr/>
+      </w:pPr>
+      <w:r>
+        <w:rPr>
+          <w:rtl w:val="0"/>
+        </w:rPr>
+      </w:r>
+    </w:p>
+    <w:p>
+      <w:pPr>
+        <w:rPr/>
+      </w:pPr>
+      <w:r>
+        <w:rPr>
+          <w:rtl w:val="0"/>
+        </w:rPr>
+        <w:t xml:space="preserve">Realizar una página para buscar y listar información de clientes.</w:t>
+      </w:r>
+    </w:p>
+    <w:p>
+      <w:pPr>
+        <w:rPr/>
+      </w:pPr>
+      <w:r>
+        <w:rPr>
+          <w:rtl w:val="0"/>
+        </w:rPr>
+        <w:t xml:space="preserve">Debe permitir buscar nombres ingresando cadenas parciales.</w:t>
       </w:r>
     </w:p>
     <w:p>
@@ -958,8 +1145,13 @@
         <w:rPr>
           <w:rtl w:val="0"/>
         </w:rPr>
-        <w:t xml:space="preserve">Registrar todos los mensajes (internos y de validaciones) en un log.</w:t>
-      </w:r>
+        <w:t xml:space="preserve">Reutilizar la base de datos del ejercicio "Listado de clientes".</w:t>
+      </w:r>
+    </w:p>
+    <w:p>
+      <w:pPr>
+        <w:rPr/>
+      </w:pPr>
       <w:r>
         <w:rPr>
           <w:rtl w:val="0"/>
@@ -1643,6 +1835,116 @@
       </w:rPr>
     </w:lvl>
   </w:abstractNum>
+  <w:abstractNum w:abstractNumId="4">
+    <w:lvl w:ilvl="0">
+      <w:start w:val="1"/>
+      <w:numFmt w:val="bullet"/>
+      <w:lvlText w:val="-"/>
+      <w:lvlJc w:val="left"/>
+      <w:pPr>
+        <w:ind w:left="720" w:hanging="360"/>
+      </w:pPr>
+      <w:rPr>
+        <w:u w:val="none"/>
+      </w:rPr>
+    </w:lvl>
+    <w:lvl w:ilvl="1">
+      <w:start w:val="1"/>
+      <w:numFmt w:val="bullet"/>
+      <w:lvlText w:val="-"/>
+      <w:lvlJc w:val="left"/>
+      <w:pPr>
+        <w:ind w:left="1440" w:hanging="360"/>
+      </w:pPr>
+      <w:rPr>
+        <w:u w:val="none"/>
+      </w:rPr>
+    </w:lvl>
+    <w:lvl w:ilvl="2">
+      <w:start w:val="1"/>
+      <w:numFmt w:val="bullet"/>
+      <w:lvlText w:val="-"/>
+      <w:lvlJc w:val="left"/>
+      <w:pPr>
+        <w:ind w:left="2160" w:hanging="360"/>
+      </w:pPr>
+      <w:rPr>
+        <w:u w:val="none"/>
+      </w:rPr>
+    </w:lvl>
+    <w:lvl w:ilvl="3">
+      <w:start w:val="1"/>
+      <w:numFmt w:val="bullet"/>
+      <w:lvlText w:val="-"/>
+      <w:lvlJc w:val="left"/>
+      <w:pPr>
+        <w:ind w:left="2880" w:hanging="360"/>
+      </w:pPr>
+      <w:rPr>
+        <w:u w:val="none"/>
+      </w:rPr>
+    </w:lvl>
+    <w:lvl w:ilvl="4">
+      <w:start w:val="1"/>
+      <w:numFmt w:val="bullet"/>
+      <w:lvlText w:val="-"/>
+      <w:lvlJc w:val="left"/>
+      <w:pPr>
+        <w:ind w:left="3600" w:hanging="360"/>
+      </w:pPr>
+      <w:rPr>
+        <w:u w:val="none"/>
+      </w:rPr>
+    </w:lvl>
+    <w:lvl w:ilvl="5">
+      <w:start w:val="1"/>
+      <w:numFmt w:val="bullet"/>
+      <w:lvlText w:val="-"/>
+      <w:lvlJc w:val="left"/>
+      <w:pPr>
+        <w:ind w:left="4320" w:hanging="360"/>
+      </w:pPr>
+      <w:rPr>
+        <w:u w:val="none"/>
+      </w:rPr>
+    </w:lvl>
+    <w:lvl w:ilvl="6">
+      <w:start w:val="1"/>
+      <w:numFmt w:val="bullet"/>
+      <w:lvlText w:val="-"/>
+      <w:lvlJc w:val="left"/>
+      <w:pPr>
+        <w:ind w:left="5040" w:hanging="360"/>
+      </w:pPr>
+      <w:rPr>
+        <w:u w:val="none"/>
+      </w:rPr>
+    </w:lvl>
+    <w:lvl w:ilvl="7">
+      <w:start w:val="1"/>
+      <w:numFmt w:val="bullet"/>
+      <w:lvlText w:val="-"/>
+      <w:lvlJc w:val="left"/>
+      <w:pPr>
+        <w:ind w:left="5760" w:hanging="360"/>
+      </w:pPr>
+      <w:rPr>
+        <w:u w:val="none"/>
+      </w:rPr>
+    </w:lvl>
+    <w:lvl w:ilvl="8">
+      <w:start w:val="1"/>
+      <w:numFmt w:val="bullet"/>
+      <w:lvlText w:val="-"/>
+      <w:lvlJc w:val="left"/>
+      <w:pPr>
+        <w:ind w:left="6480" w:hanging="360"/>
+      </w:pPr>
+      <w:rPr>
+        <w:u w:val="none"/>
+      </w:rPr>
+    </w:lvl>
+  </w:abstractNum>
   <w:num w:numId="1">
     <w:abstractNumId w:val="1"/>
   </w:num>
@@ -1651,6 +1953,9 @@
   </w:num>
   <w:num w:numId="3">
     <w:abstractNumId w:val="3"/>
+  </w:num>
+  <w:num w:numId="4">
+    <w:abstractNumId w:val="4"/>
   </w:num>
 </w:numbering>
 </file>

</xml_diff>